<commit_message>
them lai lan nua nha
</commit_message>
<xml_diff>
--- a/Lab10/Lab10.docx
+++ b/Lab10/Lab10.docx
@@ -62,6 +62,1412 @@
     <w:p>
       <w:pPr>
         <w:spacing w:line="360" w:lineRule="auto"/>
+        <w:ind w:left="284"/>
+        <w:rPr>
+          <w:rFonts w:ascii="Times New Roman" w:hAnsi="Times New Roman" w:cs="Times New Roman"/>
+          <w:sz w:val="26"/>
+          <w:szCs w:val="26"/>
+        </w:rPr>
+      </w:pPr>
+      <w:proofErr w:type="spellStart"/>
+      <w:r>
+        <w:rPr>
+          <w:rFonts w:ascii="Times New Roman" w:hAnsi="Times New Roman" w:cs="Times New Roman"/>
+          <w:sz w:val="26"/>
+          <w:szCs w:val="26"/>
+        </w:rPr>
+        <w:t>Nội</w:t>
+      </w:r>
+      <w:proofErr w:type="spellEnd"/>
+      <w:r>
+        <w:rPr>
+          <w:rFonts w:ascii="Times New Roman" w:hAnsi="Times New Roman" w:cs="Times New Roman"/>
+          <w:sz w:val="26"/>
+          <w:szCs w:val="26"/>
+        </w:rPr>
+        <w:t xml:space="preserve"> dung </w:t>
+      </w:r>
+      <w:r>
+        <w:rPr>
+          <w:rFonts w:ascii="Times New Roman" w:hAnsi="Times New Roman" w:cs="Times New Roman"/>
+          <w:sz w:val="26"/>
+          <w:szCs w:val="26"/>
+        </w:rPr>
+        <w:t>LAB 10 - API TESTING VỚI REST ASSURED + KIỂM THỬ TÍCH HỢP UI–API</w:t>
+      </w:r>
+      <w:r>
+        <w:rPr>
+          <w:rFonts w:ascii="Times New Roman" w:hAnsi="Times New Roman" w:cs="Times New Roman"/>
+          <w:sz w:val="26"/>
+          <w:szCs w:val="26"/>
+        </w:rPr>
+        <w:br/>
+      </w:r>
+      <w:proofErr w:type="spellStart"/>
+      <w:r>
+        <w:rPr>
+          <w:rFonts w:ascii="Times New Roman" w:hAnsi="Times New Roman" w:cs="Times New Roman"/>
+          <w:sz w:val="26"/>
+          <w:szCs w:val="26"/>
+        </w:rPr>
+        <w:t>Kiểm</w:t>
+      </w:r>
+      <w:proofErr w:type="spellEnd"/>
+      <w:r>
+        <w:rPr>
+          <w:rFonts w:ascii="Times New Roman" w:hAnsi="Times New Roman" w:cs="Times New Roman"/>
+          <w:sz w:val="26"/>
+          <w:szCs w:val="26"/>
+        </w:rPr>
+        <w:t xml:space="preserve"> </w:t>
+      </w:r>
+      <w:proofErr w:type="spellStart"/>
+      <w:r>
+        <w:rPr>
+          <w:rFonts w:ascii="Times New Roman" w:hAnsi="Times New Roman" w:cs="Times New Roman"/>
+          <w:sz w:val="26"/>
+          <w:szCs w:val="26"/>
+        </w:rPr>
+        <w:t>thử</w:t>
+      </w:r>
+      <w:proofErr w:type="spellEnd"/>
+      <w:r>
+        <w:rPr>
+          <w:rFonts w:ascii="Times New Roman" w:hAnsi="Times New Roman" w:cs="Times New Roman"/>
+          <w:sz w:val="26"/>
+          <w:szCs w:val="26"/>
+        </w:rPr>
+        <w:t xml:space="preserve"> REST API | </w:t>
+      </w:r>
+      <w:proofErr w:type="spellStart"/>
+      <w:r>
+        <w:rPr>
+          <w:rFonts w:ascii="Times New Roman" w:hAnsi="Times New Roman" w:cs="Times New Roman"/>
+          <w:sz w:val="26"/>
+          <w:szCs w:val="26"/>
+        </w:rPr>
+        <w:t>Kết</w:t>
+      </w:r>
+      <w:proofErr w:type="spellEnd"/>
+      <w:r>
+        <w:rPr>
+          <w:rFonts w:ascii="Times New Roman" w:hAnsi="Times New Roman" w:cs="Times New Roman"/>
+          <w:sz w:val="26"/>
+          <w:szCs w:val="26"/>
+        </w:rPr>
+        <w:t xml:space="preserve"> </w:t>
+      </w:r>
+      <w:proofErr w:type="spellStart"/>
+      <w:r>
+        <w:rPr>
+          <w:rFonts w:ascii="Times New Roman" w:hAnsi="Times New Roman" w:cs="Times New Roman"/>
+          <w:sz w:val="26"/>
+          <w:szCs w:val="26"/>
+        </w:rPr>
+        <w:t>hợp</w:t>
+      </w:r>
+      <w:proofErr w:type="spellEnd"/>
+      <w:r>
+        <w:rPr>
+          <w:rFonts w:ascii="Times New Roman" w:hAnsi="Times New Roman" w:cs="Times New Roman"/>
+          <w:sz w:val="26"/>
+          <w:szCs w:val="26"/>
+        </w:rPr>
+        <w:t xml:space="preserve"> API + UI | </w:t>
+      </w:r>
+      <w:proofErr w:type="spellStart"/>
+      <w:r>
+        <w:rPr>
+          <w:rFonts w:ascii="Times New Roman" w:hAnsi="Times New Roman" w:cs="Times New Roman"/>
+          <w:sz w:val="26"/>
+          <w:szCs w:val="26"/>
+        </w:rPr>
+        <w:t>Chương</w:t>
+      </w:r>
+      <w:proofErr w:type="spellEnd"/>
+      <w:r>
+        <w:rPr>
+          <w:rFonts w:ascii="Times New Roman" w:hAnsi="Times New Roman" w:cs="Times New Roman"/>
+          <w:sz w:val="26"/>
+          <w:szCs w:val="26"/>
+        </w:rPr>
+        <w:t xml:space="preserve"> </w:t>
+      </w:r>
+      <w:proofErr w:type="spellStart"/>
+      <w:r>
+        <w:rPr>
+          <w:rFonts w:ascii="Times New Roman" w:hAnsi="Times New Roman" w:cs="Times New Roman"/>
+          <w:sz w:val="26"/>
+          <w:szCs w:val="26"/>
+        </w:rPr>
+        <w:t>trình</w:t>
+      </w:r>
+      <w:proofErr w:type="spellEnd"/>
+      <w:r>
+        <w:rPr>
+          <w:rFonts w:ascii="Times New Roman" w:hAnsi="Times New Roman" w:cs="Times New Roman"/>
+          <w:sz w:val="26"/>
+          <w:szCs w:val="26"/>
+        </w:rPr>
+        <w:t xml:space="preserve"> 7 </w:t>
+      </w:r>
+      <w:proofErr w:type="spellStart"/>
+      <w:r>
+        <w:rPr>
+          <w:rFonts w:ascii="Times New Roman" w:hAnsi="Times New Roman" w:cs="Times New Roman"/>
+          <w:sz w:val="26"/>
+          <w:szCs w:val="26"/>
+        </w:rPr>
+        <w:t>bài</w:t>
+      </w:r>
+      <w:proofErr w:type="spellEnd"/>
+      <w:r>
+        <w:rPr>
+          <w:rFonts w:ascii="Times New Roman" w:hAnsi="Times New Roman" w:cs="Times New Roman"/>
+          <w:sz w:val="26"/>
+          <w:szCs w:val="26"/>
+        </w:rPr>
+        <w:t xml:space="preserve"> </w:t>
+      </w:r>
+      <w:proofErr w:type="spellStart"/>
+      <w:r>
+        <w:rPr>
+          <w:rFonts w:ascii="Times New Roman" w:hAnsi="Times New Roman" w:cs="Times New Roman"/>
+          <w:sz w:val="26"/>
+          <w:szCs w:val="26"/>
+        </w:rPr>
+        <w:t>tập</w:t>
+      </w:r>
+      <w:proofErr w:type="spellEnd"/>
+    </w:p>
+    <w:p>
+      <w:pPr>
+        <w:spacing w:line="360" w:lineRule="auto"/>
+        <w:ind w:left="284"/>
+        <w:rPr>
+          <w:rFonts w:ascii="Times New Roman" w:hAnsi="Times New Roman" w:cs="Times New Roman"/>
+          <w:sz w:val="26"/>
+          <w:szCs w:val="26"/>
+        </w:rPr>
+      </w:pPr>
+      <w:r>
+        <w:rPr>
+          <w:rFonts w:ascii="Times New Roman" w:hAnsi="Times New Roman" w:cs="Times New Roman"/>
+          <w:sz w:val="26"/>
+          <w:szCs w:val="26"/>
+        </w:rPr>
+        <w:t xml:space="preserve">Sau </w:t>
+      </w:r>
+      <w:proofErr w:type="spellStart"/>
+      <w:r>
+        <w:rPr>
+          <w:rFonts w:ascii="Times New Roman" w:hAnsi="Times New Roman" w:cs="Times New Roman"/>
+          <w:sz w:val="26"/>
+          <w:szCs w:val="26"/>
+        </w:rPr>
+        <w:t>khi</w:t>
+      </w:r>
+      <w:proofErr w:type="spellEnd"/>
+      <w:r>
+        <w:rPr>
+          <w:rFonts w:ascii="Times New Roman" w:hAnsi="Times New Roman" w:cs="Times New Roman"/>
+          <w:sz w:val="26"/>
+          <w:szCs w:val="26"/>
+        </w:rPr>
+        <w:t xml:space="preserve"> </w:t>
+      </w:r>
+      <w:proofErr w:type="spellStart"/>
+      <w:r>
+        <w:rPr>
+          <w:rFonts w:ascii="Times New Roman" w:hAnsi="Times New Roman" w:cs="Times New Roman"/>
+          <w:sz w:val="26"/>
+          <w:szCs w:val="26"/>
+        </w:rPr>
+        <w:t>hoàn</w:t>
+      </w:r>
+      <w:proofErr w:type="spellEnd"/>
+      <w:r>
+        <w:rPr>
+          <w:rFonts w:ascii="Times New Roman" w:hAnsi="Times New Roman" w:cs="Times New Roman"/>
+          <w:sz w:val="26"/>
+          <w:szCs w:val="26"/>
+        </w:rPr>
+        <w:t xml:space="preserve"> </w:t>
+      </w:r>
+      <w:proofErr w:type="spellStart"/>
+      <w:r>
+        <w:rPr>
+          <w:rFonts w:ascii="Times New Roman" w:hAnsi="Times New Roman" w:cs="Times New Roman"/>
+          <w:sz w:val="26"/>
+          <w:szCs w:val="26"/>
+        </w:rPr>
+        <w:t>thành</w:t>
+      </w:r>
+      <w:proofErr w:type="spellEnd"/>
+      <w:r>
+        <w:rPr>
+          <w:rFonts w:ascii="Times New Roman" w:hAnsi="Times New Roman" w:cs="Times New Roman"/>
+          <w:sz w:val="26"/>
+          <w:szCs w:val="26"/>
+        </w:rPr>
+        <w:t xml:space="preserve"> Lab 10, </w:t>
+      </w:r>
+      <w:proofErr w:type="spellStart"/>
+      <w:r>
+        <w:rPr>
+          <w:rFonts w:ascii="Times New Roman" w:hAnsi="Times New Roman" w:cs="Times New Roman"/>
+          <w:sz w:val="26"/>
+          <w:szCs w:val="26"/>
+        </w:rPr>
+        <w:t>sinh</w:t>
+      </w:r>
+      <w:proofErr w:type="spellEnd"/>
+      <w:r>
+        <w:rPr>
+          <w:rFonts w:ascii="Times New Roman" w:hAnsi="Times New Roman" w:cs="Times New Roman"/>
+          <w:sz w:val="26"/>
+          <w:szCs w:val="26"/>
+        </w:rPr>
+        <w:t xml:space="preserve"> </w:t>
+      </w:r>
+      <w:proofErr w:type="spellStart"/>
+      <w:r>
+        <w:rPr>
+          <w:rFonts w:ascii="Times New Roman" w:hAnsi="Times New Roman" w:cs="Times New Roman"/>
+          <w:sz w:val="26"/>
+          <w:szCs w:val="26"/>
+        </w:rPr>
+        <w:t>viên</w:t>
+      </w:r>
+      <w:proofErr w:type="spellEnd"/>
+      <w:r>
+        <w:rPr>
+          <w:rFonts w:ascii="Times New Roman" w:hAnsi="Times New Roman" w:cs="Times New Roman"/>
+          <w:sz w:val="26"/>
+          <w:szCs w:val="26"/>
+        </w:rPr>
+        <w:t xml:space="preserve"> </w:t>
+      </w:r>
+      <w:proofErr w:type="spellStart"/>
+      <w:r>
+        <w:rPr>
+          <w:rFonts w:ascii="Times New Roman" w:hAnsi="Times New Roman" w:cs="Times New Roman"/>
+          <w:sz w:val="26"/>
+          <w:szCs w:val="26"/>
+        </w:rPr>
+        <w:t>có</w:t>
+      </w:r>
+      <w:proofErr w:type="spellEnd"/>
+      <w:r>
+        <w:rPr>
+          <w:rFonts w:ascii="Times New Roman" w:hAnsi="Times New Roman" w:cs="Times New Roman"/>
+          <w:sz w:val="26"/>
+          <w:szCs w:val="26"/>
+        </w:rPr>
+        <w:t xml:space="preserve"> </w:t>
+      </w:r>
+      <w:proofErr w:type="spellStart"/>
+      <w:r>
+        <w:rPr>
+          <w:rFonts w:ascii="Times New Roman" w:hAnsi="Times New Roman" w:cs="Times New Roman"/>
+          <w:sz w:val="26"/>
+          <w:szCs w:val="26"/>
+        </w:rPr>
+        <w:t>thể</w:t>
+      </w:r>
+      <w:proofErr w:type="spellEnd"/>
+      <w:r>
+        <w:rPr>
+          <w:rFonts w:ascii="Times New Roman" w:hAnsi="Times New Roman" w:cs="Times New Roman"/>
+          <w:sz w:val="26"/>
+          <w:szCs w:val="26"/>
+        </w:rPr>
+        <w:t>:</w:t>
+      </w:r>
+    </w:p>
+    <w:p>
+      <w:pPr>
+        <w:spacing w:line="360" w:lineRule="auto"/>
+        <w:ind w:left="284"/>
+        <w:rPr>
+          <w:rFonts w:ascii="Times New Roman" w:hAnsi="Times New Roman" w:cs="Times New Roman"/>
+          <w:sz w:val="26"/>
+          <w:szCs w:val="26"/>
+        </w:rPr>
+      </w:pPr>
+      <w:proofErr w:type="spellStart"/>
+      <w:r>
+        <w:rPr>
+          <w:rFonts w:ascii="Times New Roman" w:hAnsi="Times New Roman" w:cs="Times New Roman"/>
+          <w:sz w:val="26"/>
+          <w:szCs w:val="26"/>
+        </w:rPr>
+        <w:t>Giải</w:t>
+      </w:r>
+      <w:proofErr w:type="spellEnd"/>
+      <w:r>
+        <w:rPr>
+          <w:rFonts w:ascii="Times New Roman" w:hAnsi="Times New Roman" w:cs="Times New Roman"/>
+          <w:sz w:val="26"/>
+          <w:szCs w:val="26"/>
+        </w:rPr>
+        <w:t xml:space="preserve"> </w:t>
+      </w:r>
+      <w:proofErr w:type="spellStart"/>
+      <w:r>
+        <w:rPr>
+          <w:rFonts w:ascii="Times New Roman" w:hAnsi="Times New Roman" w:cs="Times New Roman"/>
+          <w:sz w:val="26"/>
+          <w:szCs w:val="26"/>
+        </w:rPr>
+        <w:t>thích</w:t>
+      </w:r>
+      <w:proofErr w:type="spellEnd"/>
+      <w:r>
+        <w:rPr>
+          <w:rFonts w:ascii="Times New Roman" w:hAnsi="Times New Roman" w:cs="Times New Roman"/>
+          <w:sz w:val="26"/>
+          <w:szCs w:val="26"/>
+        </w:rPr>
+        <w:t xml:space="preserve"> </w:t>
+      </w:r>
+      <w:proofErr w:type="spellStart"/>
+      <w:r>
+        <w:rPr>
+          <w:rFonts w:ascii="Times New Roman" w:hAnsi="Times New Roman" w:cs="Times New Roman"/>
+          <w:sz w:val="26"/>
+          <w:szCs w:val="26"/>
+        </w:rPr>
+        <w:t>tại</w:t>
+      </w:r>
+      <w:proofErr w:type="spellEnd"/>
+      <w:r>
+        <w:rPr>
+          <w:rFonts w:ascii="Times New Roman" w:hAnsi="Times New Roman" w:cs="Times New Roman"/>
+          <w:sz w:val="26"/>
+          <w:szCs w:val="26"/>
+        </w:rPr>
+        <w:t xml:space="preserve"> </w:t>
+      </w:r>
+      <w:proofErr w:type="spellStart"/>
+      <w:r>
+        <w:rPr>
+          <w:rFonts w:ascii="Times New Roman" w:hAnsi="Times New Roman" w:cs="Times New Roman"/>
+          <w:sz w:val="26"/>
+          <w:szCs w:val="26"/>
+        </w:rPr>
+        <w:t>sao</w:t>
+      </w:r>
+      <w:proofErr w:type="spellEnd"/>
+      <w:r>
+        <w:rPr>
+          <w:rFonts w:ascii="Times New Roman" w:hAnsi="Times New Roman" w:cs="Times New Roman"/>
+          <w:sz w:val="26"/>
+          <w:szCs w:val="26"/>
+        </w:rPr>
+        <w:t xml:space="preserve"> API test </w:t>
+      </w:r>
+      <w:proofErr w:type="spellStart"/>
+      <w:r>
+        <w:rPr>
+          <w:rFonts w:ascii="Times New Roman" w:hAnsi="Times New Roman" w:cs="Times New Roman"/>
+          <w:sz w:val="26"/>
+          <w:szCs w:val="26"/>
+        </w:rPr>
+        <w:t>quan</w:t>
+      </w:r>
+      <w:proofErr w:type="spellEnd"/>
+      <w:r>
+        <w:rPr>
+          <w:rFonts w:ascii="Times New Roman" w:hAnsi="Times New Roman" w:cs="Times New Roman"/>
+          <w:sz w:val="26"/>
+          <w:szCs w:val="26"/>
+        </w:rPr>
+        <w:t xml:space="preserve"> </w:t>
+      </w:r>
+      <w:proofErr w:type="spellStart"/>
+      <w:r>
+        <w:rPr>
+          <w:rFonts w:ascii="Times New Roman" w:hAnsi="Times New Roman" w:cs="Times New Roman"/>
+          <w:sz w:val="26"/>
+          <w:szCs w:val="26"/>
+        </w:rPr>
+        <w:t>trọng</w:t>
+      </w:r>
+      <w:proofErr w:type="spellEnd"/>
+      <w:r>
+        <w:rPr>
+          <w:rFonts w:ascii="Times New Roman" w:hAnsi="Times New Roman" w:cs="Times New Roman"/>
+          <w:sz w:val="26"/>
+          <w:szCs w:val="26"/>
+        </w:rPr>
+        <w:t xml:space="preserve"> </w:t>
+      </w:r>
+      <w:proofErr w:type="spellStart"/>
+      <w:r>
+        <w:rPr>
+          <w:rFonts w:ascii="Times New Roman" w:hAnsi="Times New Roman" w:cs="Times New Roman"/>
+          <w:sz w:val="26"/>
+          <w:szCs w:val="26"/>
+        </w:rPr>
+        <w:t>hơn</w:t>
+      </w:r>
+      <w:proofErr w:type="spellEnd"/>
+      <w:r>
+        <w:rPr>
+          <w:rFonts w:ascii="Times New Roman" w:hAnsi="Times New Roman" w:cs="Times New Roman"/>
+          <w:sz w:val="26"/>
+          <w:szCs w:val="26"/>
+        </w:rPr>
+        <w:t xml:space="preserve"> </w:t>
+      </w:r>
+      <w:proofErr w:type="spellStart"/>
+      <w:r>
+        <w:rPr>
+          <w:rFonts w:ascii="Times New Roman" w:hAnsi="Times New Roman" w:cs="Times New Roman"/>
+          <w:sz w:val="26"/>
+          <w:szCs w:val="26"/>
+        </w:rPr>
+        <w:t>và</w:t>
+      </w:r>
+      <w:proofErr w:type="spellEnd"/>
+      <w:r>
+        <w:rPr>
+          <w:rFonts w:ascii="Times New Roman" w:hAnsi="Times New Roman" w:cs="Times New Roman"/>
+          <w:sz w:val="26"/>
+          <w:szCs w:val="26"/>
+        </w:rPr>
+        <w:t xml:space="preserve"> </w:t>
+      </w:r>
+      <w:proofErr w:type="spellStart"/>
+      <w:r>
+        <w:rPr>
+          <w:rFonts w:ascii="Times New Roman" w:hAnsi="Times New Roman" w:cs="Times New Roman"/>
+          <w:sz w:val="26"/>
+          <w:szCs w:val="26"/>
+        </w:rPr>
+        <w:t>nhanh</w:t>
+      </w:r>
+      <w:proofErr w:type="spellEnd"/>
+      <w:r>
+        <w:rPr>
+          <w:rFonts w:ascii="Times New Roman" w:hAnsi="Times New Roman" w:cs="Times New Roman"/>
+          <w:sz w:val="26"/>
+          <w:szCs w:val="26"/>
+        </w:rPr>
+        <w:t xml:space="preserve"> </w:t>
+      </w:r>
+      <w:proofErr w:type="spellStart"/>
+      <w:r>
+        <w:rPr>
+          <w:rFonts w:ascii="Times New Roman" w:hAnsi="Times New Roman" w:cs="Times New Roman"/>
+          <w:sz w:val="26"/>
+          <w:szCs w:val="26"/>
+        </w:rPr>
+        <w:t>hơn</w:t>
+      </w:r>
+      <w:proofErr w:type="spellEnd"/>
+      <w:r>
+        <w:rPr>
+          <w:rFonts w:ascii="Times New Roman" w:hAnsi="Times New Roman" w:cs="Times New Roman"/>
+          <w:sz w:val="26"/>
+          <w:szCs w:val="26"/>
+        </w:rPr>
+        <w:t xml:space="preserve"> UI test</w:t>
+      </w:r>
+    </w:p>
+    <w:p>
+      <w:pPr>
+        <w:spacing w:line="360" w:lineRule="auto"/>
+        <w:ind w:left="284"/>
+        <w:rPr>
+          <w:rFonts w:ascii="Times New Roman" w:hAnsi="Times New Roman" w:cs="Times New Roman"/>
+          <w:sz w:val="26"/>
+          <w:szCs w:val="26"/>
+        </w:rPr>
+      </w:pPr>
+      <w:proofErr w:type="spellStart"/>
+      <w:r>
+        <w:rPr>
+          <w:rFonts w:ascii="Times New Roman" w:hAnsi="Times New Roman" w:cs="Times New Roman"/>
+          <w:sz w:val="26"/>
+          <w:szCs w:val="26"/>
+        </w:rPr>
+        <w:t>Viết</w:t>
+      </w:r>
+      <w:proofErr w:type="spellEnd"/>
+      <w:r>
+        <w:rPr>
+          <w:rFonts w:ascii="Times New Roman" w:hAnsi="Times New Roman" w:cs="Times New Roman"/>
+          <w:sz w:val="26"/>
+          <w:szCs w:val="26"/>
+        </w:rPr>
+        <w:t xml:space="preserve"> test </w:t>
+      </w:r>
+      <w:proofErr w:type="spellStart"/>
+      <w:r>
+        <w:rPr>
+          <w:rFonts w:ascii="Times New Roman" w:hAnsi="Times New Roman" w:cs="Times New Roman"/>
+          <w:sz w:val="26"/>
+          <w:szCs w:val="26"/>
+        </w:rPr>
+        <w:t>kiểm</w:t>
+      </w:r>
+      <w:proofErr w:type="spellEnd"/>
+      <w:r>
+        <w:rPr>
+          <w:rFonts w:ascii="Times New Roman" w:hAnsi="Times New Roman" w:cs="Times New Roman"/>
+          <w:sz w:val="26"/>
+          <w:szCs w:val="26"/>
+        </w:rPr>
+        <w:t xml:space="preserve"> </w:t>
+      </w:r>
+      <w:proofErr w:type="spellStart"/>
+      <w:r>
+        <w:rPr>
+          <w:rFonts w:ascii="Times New Roman" w:hAnsi="Times New Roman" w:cs="Times New Roman"/>
+          <w:sz w:val="26"/>
+          <w:szCs w:val="26"/>
+        </w:rPr>
+        <w:t>thử</w:t>
+      </w:r>
+      <w:proofErr w:type="spellEnd"/>
+      <w:r>
+        <w:rPr>
+          <w:rFonts w:ascii="Times New Roman" w:hAnsi="Times New Roman" w:cs="Times New Roman"/>
+          <w:sz w:val="26"/>
+          <w:szCs w:val="26"/>
+        </w:rPr>
+        <w:t xml:space="preserve"> </w:t>
+      </w:r>
+      <w:proofErr w:type="spellStart"/>
+      <w:r>
+        <w:rPr>
+          <w:rFonts w:ascii="Times New Roman" w:hAnsi="Times New Roman" w:cs="Times New Roman"/>
+          <w:sz w:val="26"/>
+          <w:szCs w:val="26"/>
+        </w:rPr>
+        <w:t>đầy</w:t>
+      </w:r>
+      <w:proofErr w:type="spellEnd"/>
+      <w:r>
+        <w:rPr>
+          <w:rFonts w:ascii="Times New Roman" w:hAnsi="Times New Roman" w:cs="Times New Roman"/>
+          <w:sz w:val="26"/>
+          <w:szCs w:val="26"/>
+        </w:rPr>
+        <w:t xml:space="preserve"> </w:t>
+      </w:r>
+      <w:proofErr w:type="spellStart"/>
+      <w:r>
+        <w:rPr>
+          <w:rFonts w:ascii="Times New Roman" w:hAnsi="Times New Roman" w:cs="Times New Roman"/>
+          <w:sz w:val="26"/>
+          <w:szCs w:val="26"/>
+        </w:rPr>
+        <w:t>đủ</w:t>
+      </w:r>
+      <w:proofErr w:type="spellEnd"/>
+      <w:r>
+        <w:rPr>
+          <w:rFonts w:ascii="Times New Roman" w:hAnsi="Times New Roman" w:cs="Times New Roman"/>
+          <w:sz w:val="26"/>
+          <w:szCs w:val="26"/>
+        </w:rPr>
+        <w:t xml:space="preserve"> GET, POST, PUT, DELETE </w:t>
+      </w:r>
+      <w:proofErr w:type="spellStart"/>
+      <w:r>
+        <w:rPr>
+          <w:rFonts w:ascii="Times New Roman" w:hAnsi="Times New Roman" w:cs="Times New Roman"/>
+          <w:sz w:val="26"/>
+          <w:szCs w:val="26"/>
+        </w:rPr>
+        <w:t>với</w:t>
+      </w:r>
+      <w:proofErr w:type="spellEnd"/>
+      <w:r>
+        <w:rPr>
+          <w:rFonts w:ascii="Times New Roman" w:hAnsi="Times New Roman" w:cs="Times New Roman"/>
+          <w:sz w:val="26"/>
+          <w:szCs w:val="26"/>
+        </w:rPr>
+        <w:t xml:space="preserve"> REST Assured</w:t>
+      </w:r>
+    </w:p>
+    <w:p>
+      <w:pPr>
+        <w:spacing w:line="360" w:lineRule="auto"/>
+        <w:ind w:left="284"/>
+        <w:rPr>
+          <w:rFonts w:ascii="Times New Roman" w:hAnsi="Times New Roman" w:cs="Times New Roman"/>
+          <w:sz w:val="26"/>
+          <w:szCs w:val="26"/>
+        </w:rPr>
+      </w:pPr>
+      <w:proofErr w:type="spellStart"/>
+      <w:r>
+        <w:rPr>
+          <w:rFonts w:ascii="Times New Roman" w:hAnsi="Times New Roman" w:cs="Times New Roman"/>
+          <w:sz w:val="26"/>
+          <w:szCs w:val="26"/>
+        </w:rPr>
+        <w:t>Kiểm</w:t>
+      </w:r>
+      <w:proofErr w:type="spellEnd"/>
+      <w:r>
+        <w:rPr>
+          <w:rFonts w:ascii="Times New Roman" w:hAnsi="Times New Roman" w:cs="Times New Roman"/>
+          <w:sz w:val="26"/>
+          <w:szCs w:val="26"/>
+        </w:rPr>
+        <w:t xml:space="preserve"> </w:t>
+      </w:r>
+      <w:proofErr w:type="spellStart"/>
+      <w:r>
+        <w:rPr>
+          <w:rFonts w:ascii="Times New Roman" w:hAnsi="Times New Roman" w:cs="Times New Roman"/>
+          <w:sz w:val="26"/>
+          <w:szCs w:val="26"/>
+        </w:rPr>
+        <w:t>thử</w:t>
+      </w:r>
+      <w:proofErr w:type="spellEnd"/>
+      <w:r>
+        <w:rPr>
+          <w:rFonts w:ascii="Times New Roman" w:hAnsi="Times New Roman" w:cs="Times New Roman"/>
+          <w:sz w:val="26"/>
+          <w:szCs w:val="26"/>
+        </w:rPr>
+        <w:t xml:space="preserve"> </w:t>
+      </w:r>
+      <w:proofErr w:type="spellStart"/>
+      <w:r>
+        <w:rPr>
+          <w:rFonts w:ascii="Times New Roman" w:hAnsi="Times New Roman" w:cs="Times New Roman"/>
+          <w:sz w:val="26"/>
+          <w:szCs w:val="26"/>
+        </w:rPr>
+        <w:t>phản</w:t>
+      </w:r>
+      <w:proofErr w:type="spellEnd"/>
+      <w:r>
+        <w:rPr>
+          <w:rFonts w:ascii="Times New Roman" w:hAnsi="Times New Roman" w:cs="Times New Roman"/>
+          <w:sz w:val="26"/>
+          <w:szCs w:val="26"/>
+        </w:rPr>
+        <w:t xml:space="preserve"> </w:t>
+      </w:r>
+      <w:proofErr w:type="spellStart"/>
+      <w:r>
+        <w:rPr>
+          <w:rFonts w:ascii="Times New Roman" w:hAnsi="Times New Roman" w:cs="Times New Roman"/>
+          <w:sz w:val="26"/>
+          <w:szCs w:val="26"/>
+        </w:rPr>
+        <w:t>hồi</w:t>
+      </w:r>
+      <w:proofErr w:type="spellEnd"/>
+      <w:r>
+        <w:rPr>
+          <w:rFonts w:ascii="Times New Roman" w:hAnsi="Times New Roman" w:cs="Times New Roman"/>
+          <w:sz w:val="26"/>
+          <w:szCs w:val="26"/>
+        </w:rPr>
+        <w:t xml:space="preserve"> </w:t>
+      </w:r>
+      <w:proofErr w:type="spellStart"/>
+      <w:r>
+        <w:rPr>
+          <w:rFonts w:ascii="Times New Roman" w:hAnsi="Times New Roman" w:cs="Times New Roman"/>
+          <w:sz w:val="26"/>
+          <w:szCs w:val="26"/>
+        </w:rPr>
+        <w:t>lỗi</w:t>
+      </w:r>
+      <w:proofErr w:type="spellEnd"/>
+      <w:r>
+        <w:rPr>
+          <w:rFonts w:ascii="Times New Roman" w:hAnsi="Times New Roman" w:cs="Times New Roman"/>
+          <w:sz w:val="26"/>
+          <w:szCs w:val="26"/>
+        </w:rPr>
+        <w:t xml:space="preserve"> (4xx, 5xx) </w:t>
+      </w:r>
+      <w:proofErr w:type="spellStart"/>
+      <w:r>
+        <w:rPr>
+          <w:rFonts w:ascii="Times New Roman" w:hAnsi="Times New Roman" w:cs="Times New Roman"/>
+          <w:sz w:val="26"/>
+          <w:szCs w:val="26"/>
+        </w:rPr>
+        <w:t>và</w:t>
+      </w:r>
+      <w:proofErr w:type="spellEnd"/>
+      <w:r>
+        <w:rPr>
+          <w:rFonts w:ascii="Times New Roman" w:hAnsi="Times New Roman" w:cs="Times New Roman"/>
+          <w:sz w:val="26"/>
+          <w:szCs w:val="26"/>
+        </w:rPr>
+        <w:t xml:space="preserve"> </w:t>
+      </w:r>
+      <w:proofErr w:type="spellStart"/>
+      <w:r>
+        <w:rPr>
+          <w:rFonts w:ascii="Times New Roman" w:hAnsi="Times New Roman" w:cs="Times New Roman"/>
+          <w:sz w:val="26"/>
+          <w:szCs w:val="26"/>
+        </w:rPr>
+        <w:t>xử</w:t>
+      </w:r>
+      <w:proofErr w:type="spellEnd"/>
+      <w:r>
+        <w:rPr>
+          <w:rFonts w:ascii="Times New Roman" w:hAnsi="Times New Roman" w:cs="Times New Roman"/>
+          <w:sz w:val="26"/>
+          <w:szCs w:val="26"/>
+        </w:rPr>
+        <w:t xml:space="preserve"> </w:t>
+      </w:r>
+      <w:proofErr w:type="spellStart"/>
+      <w:r>
+        <w:rPr>
+          <w:rFonts w:ascii="Times New Roman" w:hAnsi="Times New Roman" w:cs="Times New Roman"/>
+          <w:sz w:val="26"/>
+          <w:szCs w:val="26"/>
+        </w:rPr>
+        <w:t>lý</w:t>
+      </w:r>
+      <w:proofErr w:type="spellEnd"/>
+      <w:r>
+        <w:rPr>
+          <w:rFonts w:ascii="Times New Roman" w:hAnsi="Times New Roman" w:cs="Times New Roman"/>
+          <w:sz w:val="26"/>
+          <w:szCs w:val="26"/>
+        </w:rPr>
+        <w:t xml:space="preserve"> exception </w:t>
+      </w:r>
+      <w:proofErr w:type="spellStart"/>
+      <w:r>
+        <w:rPr>
+          <w:rFonts w:ascii="Times New Roman" w:hAnsi="Times New Roman" w:cs="Times New Roman"/>
+          <w:sz w:val="26"/>
+          <w:szCs w:val="26"/>
+        </w:rPr>
+        <w:t>của</w:t>
+      </w:r>
+      <w:proofErr w:type="spellEnd"/>
+      <w:r>
+        <w:rPr>
+          <w:rFonts w:ascii="Times New Roman" w:hAnsi="Times New Roman" w:cs="Times New Roman"/>
+          <w:sz w:val="26"/>
+          <w:szCs w:val="26"/>
+        </w:rPr>
+        <w:t xml:space="preserve"> API</w:t>
+      </w:r>
+    </w:p>
+    <w:p>
+      <w:pPr>
+        <w:spacing w:line="360" w:lineRule="auto"/>
+        <w:ind w:left="284"/>
+        <w:rPr>
+          <w:rFonts w:ascii="Times New Roman" w:hAnsi="Times New Roman" w:cs="Times New Roman"/>
+          <w:sz w:val="26"/>
+          <w:szCs w:val="26"/>
+        </w:rPr>
+      </w:pPr>
+      <w:proofErr w:type="spellStart"/>
+      <w:r>
+        <w:rPr>
+          <w:rFonts w:ascii="Times New Roman" w:hAnsi="Times New Roman" w:cs="Times New Roman"/>
+          <w:sz w:val="26"/>
+          <w:szCs w:val="26"/>
+        </w:rPr>
+        <w:t>Thực</w:t>
+      </w:r>
+      <w:proofErr w:type="spellEnd"/>
+      <w:r>
+        <w:rPr>
+          <w:rFonts w:ascii="Times New Roman" w:hAnsi="Times New Roman" w:cs="Times New Roman"/>
+          <w:sz w:val="26"/>
+          <w:szCs w:val="26"/>
+        </w:rPr>
+        <w:t xml:space="preserve"> </w:t>
+      </w:r>
+      <w:proofErr w:type="spellStart"/>
+      <w:r>
+        <w:rPr>
+          <w:rFonts w:ascii="Times New Roman" w:hAnsi="Times New Roman" w:cs="Times New Roman"/>
+          <w:sz w:val="26"/>
+          <w:szCs w:val="26"/>
+        </w:rPr>
+        <w:t>hiện</w:t>
+      </w:r>
+      <w:proofErr w:type="spellEnd"/>
+      <w:r>
+        <w:rPr>
+          <w:rFonts w:ascii="Times New Roman" w:hAnsi="Times New Roman" w:cs="Times New Roman"/>
+          <w:sz w:val="26"/>
+          <w:szCs w:val="26"/>
+        </w:rPr>
+        <w:t xml:space="preserve"> JSON Schema Validation </w:t>
+      </w:r>
+      <w:proofErr w:type="spellStart"/>
+      <w:r>
+        <w:rPr>
+          <w:rFonts w:ascii="Times New Roman" w:hAnsi="Times New Roman" w:cs="Times New Roman"/>
+          <w:sz w:val="26"/>
+          <w:szCs w:val="26"/>
+        </w:rPr>
+        <w:t>để</w:t>
+      </w:r>
+      <w:proofErr w:type="spellEnd"/>
+      <w:r>
+        <w:rPr>
+          <w:rFonts w:ascii="Times New Roman" w:hAnsi="Times New Roman" w:cs="Times New Roman"/>
+          <w:sz w:val="26"/>
+          <w:szCs w:val="26"/>
+        </w:rPr>
+        <w:t xml:space="preserve"> </w:t>
+      </w:r>
+      <w:proofErr w:type="spellStart"/>
+      <w:r>
+        <w:rPr>
+          <w:rFonts w:ascii="Times New Roman" w:hAnsi="Times New Roman" w:cs="Times New Roman"/>
+          <w:sz w:val="26"/>
+          <w:szCs w:val="26"/>
+        </w:rPr>
+        <w:t>bảo</w:t>
+      </w:r>
+      <w:proofErr w:type="spellEnd"/>
+      <w:r>
+        <w:rPr>
+          <w:rFonts w:ascii="Times New Roman" w:hAnsi="Times New Roman" w:cs="Times New Roman"/>
+          <w:sz w:val="26"/>
+          <w:szCs w:val="26"/>
+        </w:rPr>
+        <w:t xml:space="preserve"> </w:t>
+      </w:r>
+      <w:proofErr w:type="spellStart"/>
+      <w:r>
+        <w:rPr>
+          <w:rFonts w:ascii="Times New Roman" w:hAnsi="Times New Roman" w:cs="Times New Roman"/>
+          <w:sz w:val="26"/>
+          <w:szCs w:val="26"/>
+        </w:rPr>
+        <w:t>vệ</w:t>
+      </w:r>
+      <w:proofErr w:type="spellEnd"/>
+      <w:r>
+        <w:rPr>
+          <w:rFonts w:ascii="Times New Roman" w:hAnsi="Times New Roman" w:cs="Times New Roman"/>
+          <w:sz w:val="26"/>
+          <w:szCs w:val="26"/>
+        </w:rPr>
+        <w:t xml:space="preserve"> </w:t>
+      </w:r>
+      <w:proofErr w:type="spellStart"/>
+      <w:r>
+        <w:rPr>
+          <w:rFonts w:ascii="Times New Roman" w:hAnsi="Times New Roman" w:cs="Times New Roman"/>
+          <w:sz w:val="26"/>
+          <w:szCs w:val="26"/>
+        </w:rPr>
+        <w:t>cấu</w:t>
+      </w:r>
+      <w:proofErr w:type="spellEnd"/>
+      <w:r>
+        <w:rPr>
+          <w:rFonts w:ascii="Times New Roman" w:hAnsi="Times New Roman" w:cs="Times New Roman"/>
+          <w:sz w:val="26"/>
+          <w:szCs w:val="26"/>
+        </w:rPr>
+        <w:t xml:space="preserve"> </w:t>
+      </w:r>
+      <w:proofErr w:type="spellStart"/>
+      <w:r>
+        <w:rPr>
+          <w:rFonts w:ascii="Times New Roman" w:hAnsi="Times New Roman" w:cs="Times New Roman"/>
+          <w:sz w:val="26"/>
+          <w:szCs w:val="26"/>
+        </w:rPr>
+        <w:t>trúc</w:t>
+      </w:r>
+      <w:proofErr w:type="spellEnd"/>
+      <w:r>
+        <w:rPr>
+          <w:rFonts w:ascii="Times New Roman" w:hAnsi="Times New Roman" w:cs="Times New Roman"/>
+          <w:sz w:val="26"/>
+          <w:szCs w:val="26"/>
+        </w:rPr>
+        <w:t xml:space="preserve"> response</w:t>
+      </w:r>
+    </w:p>
+    <w:p>
+      <w:pPr>
+        <w:spacing w:line="360" w:lineRule="auto"/>
+        <w:ind w:left="284"/>
+        <w:rPr>
+          <w:rFonts w:ascii="Times New Roman" w:hAnsi="Times New Roman" w:cs="Times New Roman"/>
+          <w:sz w:val="26"/>
+          <w:szCs w:val="26"/>
+        </w:rPr>
+      </w:pPr>
+      <w:proofErr w:type="spellStart"/>
+      <w:r>
+        <w:rPr>
+          <w:rFonts w:ascii="Times New Roman" w:hAnsi="Times New Roman" w:cs="Times New Roman"/>
+          <w:sz w:val="26"/>
+          <w:szCs w:val="26"/>
+        </w:rPr>
+        <w:t>Kiểm</w:t>
+      </w:r>
+      <w:proofErr w:type="spellEnd"/>
+      <w:r>
+        <w:rPr>
+          <w:rFonts w:ascii="Times New Roman" w:hAnsi="Times New Roman" w:cs="Times New Roman"/>
+          <w:sz w:val="26"/>
+          <w:szCs w:val="26"/>
+        </w:rPr>
+        <w:t xml:space="preserve"> </w:t>
+      </w:r>
+      <w:proofErr w:type="spellStart"/>
+      <w:r>
+        <w:rPr>
+          <w:rFonts w:ascii="Times New Roman" w:hAnsi="Times New Roman" w:cs="Times New Roman"/>
+          <w:sz w:val="26"/>
+          <w:szCs w:val="26"/>
+        </w:rPr>
+        <w:t>thử</w:t>
+      </w:r>
+      <w:proofErr w:type="spellEnd"/>
+      <w:r>
+        <w:rPr>
+          <w:rFonts w:ascii="Times New Roman" w:hAnsi="Times New Roman" w:cs="Times New Roman"/>
+          <w:sz w:val="26"/>
+          <w:szCs w:val="26"/>
+        </w:rPr>
+        <w:t xml:space="preserve"> authorization: endpoint </w:t>
+      </w:r>
+      <w:proofErr w:type="spellStart"/>
+      <w:r>
+        <w:rPr>
+          <w:rFonts w:ascii="Times New Roman" w:hAnsi="Times New Roman" w:cs="Times New Roman"/>
+          <w:sz w:val="26"/>
+          <w:szCs w:val="26"/>
+        </w:rPr>
+        <w:t>có</w:t>
+      </w:r>
+      <w:proofErr w:type="spellEnd"/>
+      <w:r>
+        <w:rPr>
+          <w:rFonts w:ascii="Times New Roman" w:hAnsi="Times New Roman" w:cs="Times New Roman"/>
+          <w:sz w:val="26"/>
+          <w:szCs w:val="26"/>
+        </w:rPr>
+        <w:t>/</w:t>
+      </w:r>
+      <w:proofErr w:type="spellStart"/>
+      <w:r>
+        <w:rPr>
+          <w:rFonts w:ascii="Times New Roman" w:hAnsi="Times New Roman" w:cs="Times New Roman"/>
+          <w:sz w:val="26"/>
+          <w:szCs w:val="26"/>
+        </w:rPr>
+        <w:t>không</w:t>
+      </w:r>
+      <w:proofErr w:type="spellEnd"/>
+      <w:r>
+        <w:rPr>
+          <w:rFonts w:ascii="Times New Roman" w:hAnsi="Times New Roman" w:cs="Times New Roman"/>
+          <w:sz w:val="26"/>
+          <w:szCs w:val="26"/>
+        </w:rPr>
+        <w:t xml:space="preserve"> </w:t>
+      </w:r>
+      <w:proofErr w:type="spellStart"/>
+      <w:r>
+        <w:rPr>
+          <w:rFonts w:ascii="Times New Roman" w:hAnsi="Times New Roman" w:cs="Times New Roman"/>
+          <w:sz w:val="26"/>
+          <w:szCs w:val="26"/>
+        </w:rPr>
+        <w:t>có</w:t>
+      </w:r>
+      <w:proofErr w:type="spellEnd"/>
+      <w:r>
+        <w:rPr>
+          <w:rFonts w:ascii="Times New Roman" w:hAnsi="Times New Roman" w:cs="Times New Roman"/>
+          <w:sz w:val="26"/>
+          <w:szCs w:val="26"/>
+        </w:rPr>
+        <w:t xml:space="preserve"> token</w:t>
+      </w:r>
+    </w:p>
+    <w:p>
+      <w:pPr>
+        <w:spacing w:line="360" w:lineRule="auto"/>
+        <w:ind w:left="284"/>
+        <w:rPr>
+          <w:rFonts w:ascii="Times New Roman" w:hAnsi="Times New Roman" w:cs="Times New Roman"/>
+          <w:sz w:val="26"/>
+          <w:szCs w:val="26"/>
+        </w:rPr>
+      </w:pPr>
+      <w:proofErr w:type="spellStart"/>
+      <w:r>
+        <w:rPr>
+          <w:rFonts w:ascii="Times New Roman" w:hAnsi="Times New Roman" w:cs="Times New Roman"/>
+          <w:sz w:val="26"/>
+          <w:szCs w:val="26"/>
+        </w:rPr>
+        <w:t>Kết</w:t>
+      </w:r>
+      <w:proofErr w:type="spellEnd"/>
+      <w:r>
+        <w:rPr>
+          <w:rFonts w:ascii="Times New Roman" w:hAnsi="Times New Roman" w:cs="Times New Roman"/>
+          <w:sz w:val="26"/>
+          <w:szCs w:val="26"/>
+        </w:rPr>
+        <w:t xml:space="preserve"> </w:t>
+      </w:r>
+      <w:proofErr w:type="spellStart"/>
+      <w:r>
+        <w:rPr>
+          <w:rFonts w:ascii="Times New Roman" w:hAnsi="Times New Roman" w:cs="Times New Roman"/>
+          <w:sz w:val="26"/>
+          <w:szCs w:val="26"/>
+        </w:rPr>
+        <w:t>hợp</w:t>
+      </w:r>
+      <w:proofErr w:type="spellEnd"/>
+      <w:r>
+        <w:rPr>
+          <w:rFonts w:ascii="Times New Roman" w:hAnsi="Times New Roman" w:cs="Times New Roman"/>
+          <w:sz w:val="26"/>
+          <w:szCs w:val="26"/>
+        </w:rPr>
+        <w:t xml:space="preserve"> API setup </w:t>
+      </w:r>
+      <w:proofErr w:type="spellStart"/>
+      <w:r>
+        <w:rPr>
+          <w:rFonts w:ascii="Times New Roman" w:hAnsi="Times New Roman" w:cs="Times New Roman"/>
+          <w:sz w:val="26"/>
+          <w:szCs w:val="26"/>
+        </w:rPr>
+        <w:t>với</w:t>
+      </w:r>
+      <w:proofErr w:type="spellEnd"/>
+      <w:r>
+        <w:rPr>
+          <w:rFonts w:ascii="Times New Roman" w:hAnsi="Times New Roman" w:cs="Times New Roman"/>
+          <w:sz w:val="26"/>
+          <w:szCs w:val="26"/>
+        </w:rPr>
+        <w:t xml:space="preserve"> UI test </w:t>
+      </w:r>
+      <w:proofErr w:type="spellStart"/>
+      <w:r>
+        <w:rPr>
+          <w:rFonts w:ascii="Times New Roman" w:hAnsi="Times New Roman" w:cs="Times New Roman"/>
+          <w:sz w:val="26"/>
+          <w:szCs w:val="26"/>
+        </w:rPr>
+        <w:t>để</w:t>
+      </w:r>
+      <w:proofErr w:type="spellEnd"/>
+      <w:r>
+        <w:rPr>
+          <w:rFonts w:ascii="Times New Roman" w:hAnsi="Times New Roman" w:cs="Times New Roman"/>
+          <w:sz w:val="26"/>
+          <w:szCs w:val="26"/>
+        </w:rPr>
+        <w:t xml:space="preserve"> </w:t>
+      </w:r>
+      <w:proofErr w:type="spellStart"/>
+      <w:r>
+        <w:rPr>
+          <w:rFonts w:ascii="Times New Roman" w:hAnsi="Times New Roman" w:cs="Times New Roman"/>
+          <w:sz w:val="26"/>
+          <w:szCs w:val="26"/>
+        </w:rPr>
+        <w:t>tăng</w:t>
+      </w:r>
+      <w:proofErr w:type="spellEnd"/>
+      <w:r>
+        <w:rPr>
+          <w:rFonts w:ascii="Times New Roman" w:hAnsi="Times New Roman" w:cs="Times New Roman"/>
+          <w:sz w:val="26"/>
+          <w:szCs w:val="26"/>
+        </w:rPr>
+        <w:t xml:space="preserve"> </w:t>
+      </w:r>
+      <w:proofErr w:type="spellStart"/>
+      <w:r>
+        <w:rPr>
+          <w:rFonts w:ascii="Times New Roman" w:hAnsi="Times New Roman" w:cs="Times New Roman"/>
+          <w:sz w:val="26"/>
+          <w:szCs w:val="26"/>
+        </w:rPr>
+        <w:t>tốc</w:t>
+      </w:r>
+      <w:proofErr w:type="spellEnd"/>
+      <w:r>
+        <w:rPr>
+          <w:rFonts w:ascii="Times New Roman" w:hAnsi="Times New Roman" w:cs="Times New Roman"/>
+          <w:sz w:val="26"/>
+          <w:szCs w:val="26"/>
+        </w:rPr>
+        <w:t xml:space="preserve"> </w:t>
+      </w:r>
+      <w:proofErr w:type="spellStart"/>
+      <w:r>
+        <w:rPr>
+          <w:rFonts w:ascii="Times New Roman" w:hAnsi="Times New Roman" w:cs="Times New Roman"/>
+          <w:sz w:val="26"/>
+          <w:szCs w:val="26"/>
+        </w:rPr>
+        <w:t>và</w:t>
+      </w:r>
+      <w:proofErr w:type="spellEnd"/>
+      <w:r>
+        <w:rPr>
+          <w:rFonts w:ascii="Times New Roman" w:hAnsi="Times New Roman" w:cs="Times New Roman"/>
+          <w:sz w:val="26"/>
+          <w:szCs w:val="26"/>
+        </w:rPr>
+        <w:t xml:space="preserve"> </w:t>
+      </w:r>
+      <w:proofErr w:type="spellStart"/>
+      <w:r>
+        <w:rPr>
+          <w:rFonts w:ascii="Times New Roman" w:hAnsi="Times New Roman" w:cs="Times New Roman"/>
+          <w:sz w:val="26"/>
+          <w:szCs w:val="26"/>
+        </w:rPr>
+        <w:t>giảm</w:t>
+      </w:r>
+      <w:proofErr w:type="spellEnd"/>
+      <w:r>
+        <w:rPr>
+          <w:rFonts w:ascii="Times New Roman" w:hAnsi="Times New Roman" w:cs="Times New Roman"/>
+          <w:sz w:val="26"/>
+          <w:szCs w:val="26"/>
+        </w:rPr>
+        <w:t xml:space="preserve"> flakiness</w:t>
+      </w:r>
+    </w:p>
+    <w:p>
+      <w:pPr>
+        <w:spacing w:line="360" w:lineRule="auto"/>
+        <w:ind w:left="284"/>
+        <w:rPr>
+          <w:rFonts w:ascii="Times New Roman" w:hAnsi="Times New Roman" w:cs="Times New Roman"/>
+          <w:sz w:val="26"/>
+          <w:szCs w:val="26"/>
+        </w:rPr>
+      </w:pPr>
+      <w:proofErr w:type="spellStart"/>
+      <w:r>
+        <w:rPr>
+          <w:rFonts w:ascii="Times New Roman" w:hAnsi="Times New Roman" w:cs="Times New Roman"/>
+          <w:sz w:val="26"/>
+          <w:szCs w:val="26"/>
+        </w:rPr>
+        <w:t>Xây</w:t>
+      </w:r>
+      <w:proofErr w:type="spellEnd"/>
+      <w:r>
+        <w:rPr>
+          <w:rFonts w:ascii="Times New Roman" w:hAnsi="Times New Roman" w:cs="Times New Roman"/>
+          <w:sz w:val="26"/>
+          <w:szCs w:val="26"/>
+        </w:rPr>
+        <w:t xml:space="preserve"> </w:t>
+      </w:r>
+      <w:proofErr w:type="spellStart"/>
+      <w:r>
+        <w:rPr>
+          <w:rFonts w:ascii="Times New Roman" w:hAnsi="Times New Roman" w:cs="Times New Roman"/>
+          <w:sz w:val="26"/>
+          <w:szCs w:val="26"/>
+        </w:rPr>
+        <w:t>dựng</w:t>
+      </w:r>
+      <w:proofErr w:type="spellEnd"/>
+      <w:r>
+        <w:rPr>
+          <w:rFonts w:ascii="Times New Roman" w:hAnsi="Times New Roman" w:cs="Times New Roman"/>
+          <w:sz w:val="26"/>
+          <w:szCs w:val="26"/>
+        </w:rPr>
+        <w:t xml:space="preserve"> </w:t>
+      </w:r>
+      <w:proofErr w:type="spellStart"/>
+      <w:r>
+        <w:rPr>
+          <w:rFonts w:ascii="Times New Roman" w:hAnsi="Times New Roman" w:cs="Times New Roman"/>
+          <w:sz w:val="26"/>
+          <w:szCs w:val="26"/>
+        </w:rPr>
+        <w:t>ApiBaseTest</w:t>
+      </w:r>
+      <w:proofErr w:type="spellEnd"/>
+      <w:r>
+        <w:rPr>
+          <w:rFonts w:ascii="Times New Roman" w:hAnsi="Times New Roman" w:cs="Times New Roman"/>
+          <w:sz w:val="26"/>
+          <w:szCs w:val="26"/>
+        </w:rPr>
+        <w:t xml:space="preserve"> </w:t>
+      </w:r>
+      <w:proofErr w:type="spellStart"/>
+      <w:r>
+        <w:rPr>
+          <w:rFonts w:ascii="Times New Roman" w:hAnsi="Times New Roman" w:cs="Times New Roman"/>
+          <w:sz w:val="26"/>
+          <w:szCs w:val="26"/>
+        </w:rPr>
+        <w:t>tái</w:t>
+      </w:r>
+      <w:proofErr w:type="spellEnd"/>
+      <w:r>
+        <w:rPr>
+          <w:rFonts w:ascii="Times New Roman" w:hAnsi="Times New Roman" w:cs="Times New Roman"/>
+          <w:sz w:val="26"/>
+          <w:szCs w:val="26"/>
+        </w:rPr>
+        <w:t xml:space="preserve"> </w:t>
+      </w:r>
+      <w:proofErr w:type="spellStart"/>
+      <w:r>
+        <w:rPr>
+          <w:rFonts w:ascii="Times New Roman" w:hAnsi="Times New Roman" w:cs="Times New Roman"/>
+          <w:sz w:val="26"/>
+          <w:szCs w:val="26"/>
+        </w:rPr>
+        <w:t>sử</w:t>
+      </w:r>
+      <w:proofErr w:type="spellEnd"/>
+      <w:r>
+        <w:rPr>
+          <w:rFonts w:ascii="Times New Roman" w:hAnsi="Times New Roman" w:cs="Times New Roman"/>
+          <w:sz w:val="26"/>
+          <w:szCs w:val="26"/>
+        </w:rPr>
+        <w:t xml:space="preserve"> </w:t>
+      </w:r>
+      <w:proofErr w:type="spellStart"/>
+      <w:r>
+        <w:rPr>
+          <w:rFonts w:ascii="Times New Roman" w:hAnsi="Times New Roman" w:cs="Times New Roman"/>
+          <w:sz w:val="26"/>
+          <w:szCs w:val="26"/>
+        </w:rPr>
+        <w:t>dụng</w:t>
+      </w:r>
+      <w:proofErr w:type="spellEnd"/>
+      <w:r>
+        <w:rPr>
+          <w:rFonts w:ascii="Times New Roman" w:hAnsi="Times New Roman" w:cs="Times New Roman"/>
+          <w:sz w:val="26"/>
+          <w:szCs w:val="26"/>
+        </w:rPr>
+        <w:t xml:space="preserve"> </w:t>
+      </w:r>
+      <w:proofErr w:type="spellStart"/>
+      <w:r>
+        <w:rPr>
+          <w:rFonts w:ascii="Times New Roman" w:hAnsi="Times New Roman" w:cs="Times New Roman"/>
+          <w:sz w:val="26"/>
+          <w:szCs w:val="26"/>
+        </w:rPr>
+        <w:t>cho</w:t>
+      </w:r>
+      <w:proofErr w:type="spellEnd"/>
+      <w:r>
+        <w:rPr>
+          <w:rFonts w:ascii="Times New Roman" w:hAnsi="Times New Roman" w:cs="Times New Roman"/>
+          <w:sz w:val="26"/>
+          <w:szCs w:val="26"/>
+        </w:rPr>
+        <w:t xml:space="preserve"> </w:t>
+      </w:r>
+      <w:proofErr w:type="spellStart"/>
+      <w:r>
+        <w:rPr>
+          <w:rFonts w:ascii="Times New Roman" w:hAnsi="Times New Roman" w:cs="Times New Roman"/>
+          <w:sz w:val="26"/>
+          <w:szCs w:val="26"/>
+        </w:rPr>
+        <w:t>toàn</w:t>
+      </w:r>
+      <w:proofErr w:type="spellEnd"/>
+      <w:r>
+        <w:rPr>
+          <w:rFonts w:ascii="Times New Roman" w:hAnsi="Times New Roman" w:cs="Times New Roman"/>
+          <w:sz w:val="26"/>
+          <w:szCs w:val="26"/>
+        </w:rPr>
+        <w:t xml:space="preserve"> </w:t>
+      </w:r>
+      <w:proofErr w:type="spellStart"/>
+      <w:r>
+        <w:rPr>
+          <w:rFonts w:ascii="Times New Roman" w:hAnsi="Times New Roman" w:cs="Times New Roman"/>
+          <w:sz w:val="26"/>
+          <w:szCs w:val="26"/>
+        </w:rPr>
+        <w:t>dự</w:t>
+      </w:r>
+      <w:proofErr w:type="spellEnd"/>
+      <w:r>
+        <w:rPr>
+          <w:rFonts w:ascii="Times New Roman" w:hAnsi="Times New Roman" w:cs="Times New Roman"/>
+          <w:sz w:val="26"/>
+          <w:szCs w:val="26"/>
+        </w:rPr>
+        <w:t xml:space="preserve"> </w:t>
+      </w:r>
+      <w:proofErr w:type="spellStart"/>
+      <w:r>
+        <w:rPr>
+          <w:rFonts w:ascii="Times New Roman" w:hAnsi="Times New Roman" w:cs="Times New Roman"/>
+          <w:sz w:val="26"/>
+          <w:szCs w:val="26"/>
+        </w:rPr>
+        <w:t>án</w:t>
+      </w:r>
+      <w:proofErr w:type="spellEnd"/>
+      <w:r>
+        <w:rPr>
+          <w:rFonts w:ascii="Times New Roman" w:hAnsi="Times New Roman" w:cs="Times New Roman"/>
+          <w:sz w:val="26"/>
+          <w:szCs w:val="26"/>
+        </w:rPr>
+        <w:br w:type="page"/>
+      </w:r>
+    </w:p>
+    <w:p>
+      <w:pPr>
+        <w:spacing w:line="360" w:lineRule="auto"/>
+        <w:jc w:val="center"/>
+        <w:rPr>
+          <w:rFonts w:ascii="Times New Roman" w:hAnsi="Times New Roman" w:cs="Times New Roman"/>
+          <w:b/>
+          <w:bCs/>
+          <w:sz w:val="50"/>
+          <w:szCs w:val="50"/>
+        </w:rPr>
+      </w:pPr>
+    </w:p>
+    <w:p>
+      <w:pPr>
+        <w:spacing w:line="360" w:lineRule="auto"/>
         <w:rPr>
           <w:rFonts w:ascii="Times New Roman" w:hAnsi="Times New Roman" w:cs="Times New Roman"/>
           <w:b/>
@@ -7368,18 +8774,8 @@
           <w:sz w:val="26"/>
           <w:szCs w:val="26"/>
         </w:rPr>
-        <w:t xml:space="preserve"> </w:t>
-      </w:r>
-      <w:proofErr w:type="spellStart"/>
-      <w:r>
-        <w:rPr>
-          <w:rFonts w:ascii="Times New Roman" w:hAnsi="Times New Roman" w:cs="Times New Roman"/>
-          <w:sz w:val="26"/>
-          <w:szCs w:val="26"/>
-        </w:rPr>
-        <w:t>equalTo</w:t>
-      </w:r>
-      <w:proofErr w:type="spellEnd"/>
+        <w:t xml:space="preserve"> equalTo</w:t>
+      </w:r>
     </w:p>
     <w:p>
       <w:pPr>
@@ -7987,18 +9383,8 @@
           <w:sz w:val="26"/>
           <w:szCs w:val="26"/>
         </w:rPr>
-        <w:t xml:space="preserve"> </w:t>
-      </w:r>
-      <w:proofErr w:type="spellStart"/>
-      <w:r>
-        <w:rPr>
-          <w:rFonts w:ascii="Times New Roman" w:hAnsi="Times New Roman" w:cs="Times New Roman"/>
-          <w:sz w:val="26"/>
-          <w:szCs w:val="26"/>
-        </w:rPr>
-        <w:t>equalTo</w:t>
-      </w:r>
-      <w:proofErr w:type="spellEnd"/>
+        <w:t xml:space="preserve"> equalTo</w:t>
+      </w:r>
     </w:p>
     <w:p>
       <w:pPr>
@@ -14835,6 +16221,7 @@
       <w:r>
         <w:rPr>
           <w:rFonts w:ascii="Times New Roman" w:hAnsi="Times New Roman" w:cs="Times New Roman"/>
+          <w:noProof/>
           <w:sz w:val="26"/>
           <w:szCs w:val="26"/>
         </w:rPr>
@@ -20930,6 +22317,7 @@
       <w:r>
         <w:rPr>
           <w:rFonts w:ascii="Times New Roman" w:hAnsi="Times New Roman" w:cs="Times New Roman"/>
+          <w:noProof/>
           <w:sz w:val="26"/>
           <w:szCs w:val="26"/>
         </w:rPr>
@@ -25965,6 +27353,7 @@
       <w:r>
         <w:rPr>
           <w:rFonts w:ascii="Times New Roman" w:hAnsi="Times New Roman" w:cs="Times New Roman"/>
+          <w:noProof/>
           <w:sz w:val="26"/>
           <w:szCs w:val="26"/>
         </w:rPr>
@@ -31268,25 +32657,7 @@
           <w:sz w:val="26"/>
           <w:szCs w:val="26"/>
         </w:rPr>
-        <w:t xml:space="preserve"> </w:t>
-      </w:r>
-      <w:proofErr w:type="spellStart"/>
-      <w:r>
-        <w:rPr>
-          <w:rFonts w:ascii="Times New Roman" w:hAnsi="Times New Roman" w:cs="Times New Roman"/>
-          <w:sz w:val="26"/>
-          <w:szCs w:val="26"/>
-        </w:rPr>
-        <w:t>đúng</w:t>
-      </w:r>
-      <w:proofErr w:type="spellEnd"/>
-      <w:r>
-        <w:rPr>
-          <w:rFonts w:ascii="Times New Roman" w:hAnsi="Times New Roman" w:cs="Times New Roman"/>
-          <w:sz w:val="26"/>
-          <w:szCs w:val="26"/>
-        </w:rPr>
-        <w:t xml:space="preserve"> port</w:t>
+        <w:t xml:space="preserve"> đúng port</w:t>
       </w:r>
     </w:p>
     <w:p>
@@ -33596,6 +34967,7 @@
       <w:r>
         <w:rPr>
           <w:rFonts w:ascii="Times New Roman" w:hAnsi="Times New Roman" w:cs="Times New Roman"/>
+          <w:noProof/>
           <w:sz w:val="26"/>
           <w:szCs w:val="26"/>
         </w:rPr>
@@ -37554,6 +38926,7 @@
       <w:r>
         <w:rPr>
           <w:rFonts w:ascii="Times New Roman" w:hAnsi="Times New Roman" w:cs="Times New Roman"/>
+          <w:noProof/>
           <w:sz w:val="26"/>
           <w:szCs w:val="26"/>
         </w:rPr>
@@ -42486,6 +43859,7 @@
       <w:r>
         <w:rPr>
           <w:rFonts w:ascii="Times New Roman" w:hAnsi="Times New Roman" w:cs="Times New Roman"/>
+          <w:noProof/>
           <w:sz w:val="26"/>
           <w:szCs w:val="26"/>
         </w:rPr>
@@ -42577,17 +43951,7 @@
           <w:sz w:val="26"/>
           <w:szCs w:val="26"/>
         </w:rPr>
-        <w:t xml:space="preserve"> 7: </w:t>
-      </w:r>
-      <w:r>
-        <w:rPr>
-          <w:rFonts w:ascii="Times New Roman" w:hAnsi="Times New Roman" w:cs="Times New Roman"/>
-          <w:b/>
-          <w:bCs/>
-          <w:sz w:val="26"/>
-          <w:szCs w:val="26"/>
-        </w:rPr>
-        <w:t>DỰ ÁN TỔNG HỢP: KIỂM THỬ API JSONPLACEHOLDER</w:t>
+        <w:t xml:space="preserve"> 7: DỰ ÁN TỔNG HỢP: KIỂM THỬ API JSONPLACEHOLDER</w:t>
       </w:r>
     </w:p>
     <w:p>

</xml_diff>